<commit_message>
docs: update student name to Đỗ Ngọc Anh and specify detailed port mapping across reports
</commit_message>
<xml_diff>
--- a/docs/BAO_CAO_THUC_HANH_TKQTPM.docx
+++ b/docs/BAO_CAO_THUC_HANH_TKQTPM.docx
@@ -89,7 +89,7 @@
           <w:color w:val="475569"/>
           <w:sz w:val="22"/>
         </w:rPr>
-        <w:t xml:space="preserve"> **Sinh viên thực hiện**: `dtc245200527-coder`</w:t>
+        <w:t xml:space="preserve"> **Sinh viên thực hiện**: **Đỗ Ngọc Anh</w:t>
       </w:r>
     </w:p>
     <w:p>
@@ -397,6 +397,2128 @@
     </w:p>
     <w:p>
       <w:pPr>
+        <w:spacing w:before="200" w:after="80"/>
+      </w:pPr>
+      <w:r>
+        <w:rPr>
+          <w:b/>
+          <w:color w:val="1E293B"/>
+          <w:sz w:val="27"/>
+        </w:rPr>
+        <w:t>1.3. Bảng quy hoạch chi tiết các cổng và dịch vụ hệ thống (Port Mapping)</w:t>
+      </w:r>
+    </w:p>
+    <w:p>
+      <w:pPr>
+        <w:jc w:val="both"/>
+      </w:pPr>
+      <w:r>
+        <w:t>Hệ thống phân định rành mạch giữa các cổng công khai tiếp nhận lưu lượng từ người dùng/quản trị viên (Host Ports) và các cổng dịch vụ nội bộ được cô lập hoàn toàn giữa các container theo nguyên tắc phòng thủ đa lớp (Defense in Depth):</w:t>
+      </w:r>
+    </w:p>
+    <w:p>
+      <w:pPr>
+        <w:spacing w:before="120" w:after="40"/>
+      </w:pPr>
+      <w:r>
+        <w:rPr>
+          <w:b/>
+          <w:color w:val="334155"/>
+          <w:sz w:val="26"/>
+        </w:rPr>
+        <w:t>Bảng các cổng công khai mở ra ngoài Host:</w:t>
+      </w:r>
+    </w:p>
+    <w:tbl>
+      <w:tblPr>
+        <w:tblW w:type="auto" w:w="0"/>
+        <w:jc w:val="center"/>
+        <w:tblLook w:firstColumn="1" w:firstRow="1" w:lastColumn="0" w:lastRow="0" w:noHBand="0" w:noVBand="1" w:val="04A0"/>
+        <w:tblBorders>
+          <w:top w:val="single" w:sz="4" w:space="0" w:color="94A3B8"/>
+          <w:bottom w:val="single" w:sz="4" w:space="0" w:color="94A3B8"/>
+          <w:insideH w:val="single" w:sz="4" w:space="0" w:color="CBD5E1"/>
+          <w:insideV w:val="none"/>
+        </w:tblBorders>
+      </w:tblPr>
+      <w:tblGrid>
+        <w:gridCol w:w="1560"/>
+        <w:gridCol w:w="1560"/>
+        <w:gridCol w:w="1560"/>
+        <w:gridCol w:w="1560"/>
+        <w:gridCol w:w="1560"/>
+        <w:gridCol w:w="1560"/>
+      </w:tblGrid>
+      <w:tr>
+        <w:tc>
+          <w:tcPr>
+            <w:tcW w:type="dxa" w:w="1560"/>
+            <w:tcMar>
+              <w:top w:w="80" w:type="dxa"/>
+              <w:bottom w:w="80" w:type="dxa"/>
+              <w:left w:w="100" w:type="dxa"/>
+              <w:right w:w="100" w:type="dxa"/>
+            </w:tcMar>
+            <w:shd w:fill="E2E8F0"/>
+          </w:tcPr>
+          <w:p>
+            <w:pPr>
+              <w:spacing w:before="40" w:after="40" w:line="276" w:lineRule="auto"/>
+            </w:pPr>
+            <w:r>
+              <w:rPr>
+                <w:b/>
+                <w:sz w:val="22"/>
+              </w:rPr>
+              <w:t>STT</w:t>
+            </w:r>
+          </w:p>
+        </w:tc>
+        <w:tc>
+          <w:tcPr>
+            <w:tcW w:type="dxa" w:w="1560"/>
+            <w:tcMar>
+              <w:top w:w="80" w:type="dxa"/>
+              <w:bottom w:w="80" w:type="dxa"/>
+              <w:left w:w="100" w:type="dxa"/>
+              <w:right w:w="100" w:type="dxa"/>
+            </w:tcMar>
+            <w:shd w:fill="E2E8F0"/>
+          </w:tcPr>
+          <w:p>
+            <w:pPr>
+              <w:spacing w:before="40" w:after="40" w:line="276" w:lineRule="auto"/>
+            </w:pPr>
+            <w:r>
+              <w:rPr>
+                <w:b/>
+                <w:sz w:val="22"/>
+              </w:rPr>
+              <w:t>Tên Dịch Vụ (Container)</w:t>
+            </w:r>
+          </w:p>
+        </w:tc>
+        <w:tc>
+          <w:tcPr>
+            <w:tcW w:type="dxa" w:w="1560"/>
+            <w:tcMar>
+              <w:top w:w="80" w:type="dxa"/>
+              <w:bottom w:w="80" w:type="dxa"/>
+              <w:left w:w="100" w:type="dxa"/>
+              <w:right w:w="100" w:type="dxa"/>
+            </w:tcMar>
+            <w:shd w:fill="E2E8F0"/>
+          </w:tcPr>
+          <w:p>
+            <w:pPr>
+              <w:spacing w:before="40" w:after="40" w:line="276" w:lineRule="auto"/>
+            </w:pPr>
+            <w:r>
+              <w:rPr>
+                <w:b/>
+                <w:sz w:val="22"/>
+              </w:rPr>
+              <w:t>Cổng Host</w:t>
+            </w:r>
+          </w:p>
+        </w:tc>
+        <w:tc>
+          <w:tcPr>
+            <w:tcW w:type="dxa" w:w="1560"/>
+            <w:tcMar>
+              <w:top w:w="80" w:type="dxa"/>
+              <w:bottom w:w="80" w:type="dxa"/>
+              <w:left w:w="100" w:type="dxa"/>
+              <w:right w:w="100" w:type="dxa"/>
+            </w:tcMar>
+            <w:shd w:fill="E2E8F0"/>
+          </w:tcPr>
+          <w:p>
+            <w:pPr>
+              <w:spacing w:before="40" w:after="40" w:line="276" w:lineRule="auto"/>
+            </w:pPr>
+            <w:r>
+              <w:rPr>
+                <w:b/>
+                <w:sz w:val="22"/>
+              </w:rPr>
+              <w:t>Giao thức</w:t>
+            </w:r>
+          </w:p>
+        </w:tc>
+        <w:tc>
+          <w:tcPr>
+            <w:tcW w:type="dxa" w:w="1560"/>
+            <w:tcMar>
+              <w:top w:w="80" w:type="dxa"/>
+              <w:bottom w:w="80" w:type="dxa"/>
+              <w:left w:w="100" w:type="dxa"/>
+              <w:right w:w="100" w:type="dxa"/>
+            </w:tcMar>
+            <w:shd w:fill="E2E8F0"/>
+          </w:tcPr>
+          <w:p>
+            <w:pPr>
+              <w:spacing w:before="40" w:after="40" w:line="276" w:lineRule="auto"/>
+            </w:pPr>
+            <w:r>
+              <w:rPr>
+                <w:b/>
+                <w:sz w:val="22"/>
+              </w:rPr>
+              <w:t>Địa chỉ truy cập</w:t>
+            </w:r>
+          </w:p>
+        </w:tc>
+        <w:tc>
+          <w:tcPr>
+            <w:tcW w:type="dxa" w:w="1560"/>
+            <w:tcMar>
+              <w:top w:w="80" w:type="dxa"/>
+              <w:bottom w:w="80" w:type="dxa"/>
+              <w:left w:w="100" w:type="dxa"/>
+              <w:right w:w="100" w:type="dxa"/>
+            </w:tcMar>
+            <w:shd w:fill="E2E8F0"/>
+          </w:tcPr>
+          <w:p>
+            <w:pPr>
+              <w:spacing w:before="40" w:after="40" w:line="276" w:lineRule="auto"/>
+            </w:pPr>
+            <w:r>
+              <w:rPr>
+                <w:b/>
+                <w:sz w:val="22"/>
+              </w:rPr>
+              <w:t>Chức năng và Mục đích sử dụng</w:t>
+            </w:r>
+          </w:p>
+        </w:tc>
+      </w:tr>
+      <w:tr>
+        <w:tc>
+          <w:tcPr>
+            <w:tcW w:type="dxa" w:w="1560"/>
+            <w:tcMar>
+              <w:top w:w="80" w:type="dxa"/>
+              <w:bottom w:w="80" w:type="dxa"/>
+              <w:left w:w="100" w:type="dxa"/>
+              <w:right w:w="100" w:type="dxa"/>
+            </w:tcMar>
+          </w:tcPr>
+          <w:p>
+            <w:pPr>
+              <w:spacing w:before="40" w:after="40" w:line="276" w:lineRule="auto"/>
+            </w:pPr>
+            <w:r>
+              <w:rPr>
+                <w:sz w:val="22"/>
+              </w:rPr>
+              <w:t>**1**</w:t>
+            </w:r>
+          </w:p>
+        </w:tc>
+        <w:tc>
+          <w:tcPr>
+            <w:tcW w:type="dxa" w:w="1560"/>
+            <w:tcMar>
+              <w:top w:w="80" w:type="dxa"/>
+              <w:bottom w:w="80" w:type="dxa"/>
+              <w:left w:w="100" w:type="dxa"/>
+              <w:right w:w="100" w:type="dxa"/>
+            </w:tcMar>
+          </w:tcPr>
+          <w:p>
+            <w:pPr>
+              <w:spacing w:before="40" w:after="40" w:line="276" w:lineRule="auto"/>
+            </w:pPr>
+            <w:r>
+              <w:rPr>
+                <w:sz w:val="22"/>
+              </w:rPr>
+              <w:t>**Nginx Reverse Proxy** (`sms-nginx`)</w:t>
+            </w:r>
+          </w:p>
+        </w:tc>
+        <w:tc>
+          <w:tcPr>
+            <w:tcW w:type="dxa" w:w="1560"/>
+            <w:tcMar>
+              <w:top w:w="80" w:type="dxa"/>
+              <w:bottom w:w="80" w:type="dxa"/>
+              <w:left w:w="100" w:type="dxa"/>
+              <w:right w:w="100" w:type="dxa"/>
+            </w:tcMar>
+          </w:tcPr>
+          <w:p>
+            <w:pPr>
+              <w:spacing w:before="40" w:after="40" w:line="276" w:lineRule="auto"/>
+            </w:pPr>
+            <w:r>
+              <w:rPr>
+                <w:sz w:val="22"/>
+              </w:rPr>
+              <w:t>**`443`**</w:t>
+            </w:r>
+          </w:p>
+        </w:tc>
+        <w:tc>
+          <w:tcPr>
+            <w:tcW w:type="dxa" w:w="1560"/>
+            <w:tcMar>
+              <w:top w:w="80" w:type="dxa"/>
+              <w:bottom w:w="80" w:type="dxa"/>
+              <w:left w:w="100" w:type="dxa"/>
+              <w:right w:w="100" w:type="dxa"/>
+            </w:tcMar>
+          </w:tcPr>
+          <w:p>
+            <w:pPr>
+              <w:spacing w:before="40" w:after="40" w:line="276" w:lineRule="auto"/>
+            </w:pPr>
+            <w:r>
+              <w:rPr>
+                <w:sz w:val="22"/>
+              </w:rPr>
+              <w:t>HTTPS</w:t>
+            </w:r>
+          </w:p>
+        </w:tc>
+        <w:tc>
+          <w:tcPr>
+            <w:tcW w:type="dxa" w:w="1560"/>
+            <w:tcMar>
+              <w:top w:w="80" w:type="dxa"/>
+              <w:bottom w:w="80" w:type="dxa"/>
+              <w:left w:w="100" w:type="dxa"/>
+              <w:right w:w="100" w:type="dxa"/>
+            </w:tcMar>
+          </w:tcPr>
+          <w:p>
+            <w:pPr>
+              <w:spacing w:before="40" w:after="40" w:line="276" w:lineRule="auto"/>
+            </w:pPr>
+            <w:r>
+              <w:rPr>
+                <w:sz w:val="22"/>
+              </w:rPr>
+              <w:t>[https://localhost](https://localhost)</w:t>
+            </w:r>
+          </w:p>
+        </w:tc>
+        <w:tc>
+          <w:tcPr>
+            <w:tcW w:type="dxa" w:w="1560"/>
+            <w:tcMar>
+              <w:top w:w="80" w:type="dxa"/>
+              <w:bottom w:w="80" w:type="dxa"/>
+              <w:left w:w="100" w:type="dxa"/>
+              <w:right w:w="100" w:type="dxa"/>
+            </w:tcMar>
+          </w:tcPr>
+          <w:p>
+            <w:pPr>
+              <w:spacing w:before="40" w:after="40" w:line="276" w:lineRule="auto"/>
+            </w:pPr>
+            <w:r>
+              <w:rPr>
+                <w:sz w:val="22"/>
+              </w:rPr>
+              <w:t>Cổng bảo mật chính (Gateway), SSL/TLS tự ký, 5 Security Headers, reverse proxy vào Web App</w:t>
+            </w:r>
+          </w:p>
+        </w:tc>
+      </w:tr>
+      <w:tr>
+        <w:tc>
+          <w:tcPr>
+            <w:tcW w:type="dxa" w:w="1560"/>
+            <w:tcMar>
+              <w:top w:w="80" w:type="dxa"/>
+              <w:bottom w:w="80" w:type="dxa"/>
+              <w:left w:w="100" w:type="dxa"/>
+              <w:right w:w="100" w:type="dxa"/>
+            </w:tcMar>
+          </w:tcPr>
+          <w:p>
+            <w:pPr>
+              <w:spacing w:before="40" w:after="40" w:line="276" w:lineRule="auto"/>
+            </w:pPr>
+            <w:r>
+              <w:rPr>
+                <w:sz w:val="22"/>
+              </w:rPr>
+              <w:t>**2**</w:t>
+            </w:r>
+          </w:p>
+        </w:tc>
+        <w:tc>
+          <w:tcPr>
+            <w:tcW w:type="dxa" w:w="1560"/>
+            <w:tcMar>
+              <w:top w:w="80" w:type="dxa"/>
+              <w:bottom w:w="80" w:type="dxa"/>
+              <w:left w:w="100" w:type="dxa"/>
+              <w:right w:w="100" w:type="dxa"/>
+            </w:tcMar>
+          </w:tcPr>
+          <w:p>
+            <w:pPr>
+              <w:spacing w:before="40" w:after="40" w:line="276" w:lineRule="auto"/>
+            </w:pPr>
+            <w:r>
+              <w:rPr>
+                <w:sz w:val="22"/>
+              </w:rPr>
+              <w:t>**Nginx Reverse Proxy** (`sms-nginx`)</w:t>
+            </w:r>
+          </w:p>
+        </w:tc>
+        <w:tc>
+          <w:tcPr>
+            <w:tcW w:type="dxa" w:w="1560"/>
+            <w:tcMar>
+              <w:top w:w="80" w:type="dxa"/>
+              <w:bottom w:w="80" w:type="dxa"/>
+              <w:left w:w="100" w:type="dxa"/>
+              <w:right w:w="100" w:type="dxa"/>
+            </w:tcMar>
+          </w:tcPr>
+          <w:p>
+            <w:pPr>
+              <w:spacing w:before="40" w:after="40" w:line="276" w:lineRule="auto"/>
+            </w:pPr>
+            <w:r>
+              <w:rPr>
+                <w:sz w:val="22"/>
+              </w:rPr>
+              <w:t>**`80`**</w:t>
+            </w:r>
+          </w:p>
+        </w:tc>
+        <w:tc>
+          <w:tcPr>
+            <w:tcW w:type="dxa" w:w="1560"/>
+            <w:tcMar>
+              <w:top w:w="80" w:type="dxa"/>
+              <w:bottom w:w="80" w:type="dxa"/>
+              <w:left w:w="100" w:type="dxa"/>
+              <w:right w:w="100" w:type="dxa"/>
+            </w:tcMar>
+          </w:tcPr>
+          <w:p>
+            <w:pPr>
+              <w:spacing w:before="40" w:after="40" w:line="276" w:lineRule="auto"/>
+            </w:pPr>
+            <w:r>
+              <w:rPr>
+                <w:sz w:val="22"/>
+              </w:rPr>
+              <w:t>HTTP</w:t>
+            </w:r>
+          </w:p>
+        </w:tc>
+        <w:tc>
+          <w:tcPr>
+            <w:tcW w:type="dxa" w:w="1560"/>
+            <w:tcMar>
+              <w:top w:w="80" w:type="dxa"/>
+              <w:bottom w:w="80" w:type="dxa"/>
+              <w:left w:w="100" w:type="dxa"/>
+              <w:right w:w="100" w:type="dxa"/>
+            </w:tcMar>
+          </w:tcPr>
+          <w:p>
+            <w:pPr>
+              <w:spacing w:before="40" w:after="40" w:line="276" w:lineRule="auto"/>
+            </w:pPr>
+            <w:r>
+              <w:rPr>
+                <w:sz w:val="22"/>
+              </w:rPr>
+              <w:t>[http://localhost](http://localhost)</w:t>
+            </w:r>
+          </w:p>
+        </w:tc>
+        <w:tc>
+          <w:tcPr>
+            <w:tcW w:type="dxa" w:w="1560"/>
+            <w:tcMar>
+              <w:top w:w="80" w:type="dxa"/>
+              <w:bottom w:w="80" w:type="dxa"/>
+              <w:left w:w="100" w:type="dxa"/>
+              <w:right w:w="100" w:type="dxa"/>
+            </w:tcMar>
+          </w:tcPr>
+          <w:p>
+            <w:pPr>
+              <w:spacing w:before="40" w:after="40" w:line="276" w:lineRule="auto"/>
+            </w:pPr>
+            <w:r>
+              <w:rPr>
+                <w:sz w:val="22"/>
+              </w:rPr>
+              <w:t>Cổng tiếp nhận HTTP, tự động chuyển hướng an toàn (HTTP 301 Redirect) sang HTTPS cổng 443</w:t>
+            </w:r>
+          </w:p>
+        </w:tc>
+      </w:tr>
+      <w:tr>
+        <w:tc>
+          <w:tcPr>
+            <w:tcW w:type="dxa" w:w="1560"/>
+            <w:tcMar>
+              <w:top w:w="80" w:type="dxa"/>
+              <w:bottom w:w="80" w:type="dxa"/>
+              <w:left w:w="100" w:type="dxa"/>
+              <w:right w:w="100" w:type="dxa"/>
+            </w:tcMar>
+          </w:tcPr>
+          <w:p>
+            <w:pPr>
+              <w:spacing w:before="40" w:after="40" w:line="276" w:lineRule="auto"/>
+            </w:pPr>
+            <w:r>
+              <w:rPr>
+                <w:sz w:val="22"/>
+              </w:rPr>
+              <w:t>**3**</w:t>
+            </w:r>
+          </w:p>
+        </w:tc>
+        <w:tc>
+          <w:tcPr>
+            <w:tcW w:type="dxa" w:w="1560"/>
+            <w:tcMar>
+              <w:top w:w="80" w:type="dxa"/>
+              <w:bottom w:w="80" w:type="dxa"/>
+              <w:left w:w="100" w:type="dxa"/>
+              <w:right w:w="100" w:type="dxa"/>
+            </w:tcMar>
+          </w:tcPr>
+          <w:p>
+            <w:pPr>
+              <w:spacing w:before="40" w:after="40" w:line="276" w:lineRule="auto"/>
+            </w:pPr>
+            <w:r>
+              <w:rPr>
+                <w:sz w:val="22"/>
+              </w:rPr>
+              <w:t>**Ứng dụng Web Quản lý SV** (`sms-app`)</w:t>
+            </w:r>
+          </w:p>
+        </w:tc>
+        <w:tc>
+          <w:tcPr>
+            <w:tcW w:type="dxa" w:w="1560"/>
+            <w:tcMar>
+              <w:top w:w="80" w:type="dxa"/>
+              <w:bottom w:w="80" w:type="dxa"/>
+              <w:left w:w="100" w:type="dxa"/>
+              <w:right w:w="100" w:type="dxa"/>
+            </w:tcMar>
+          </w:tcPr>
+          <w:p>
+            <w:pPr>
+              <w:spacing w:before="40" w:after="40" w:line="276" w:lineRule="auto"/>
+            </w:pPr>
+            <w:r>
+              <w:rPr>
+                <w:sz w:val="22"/>
+              </w:rPr>
+              <w:t>**`3000`**</w:t>
+            </w:r>
+          </w:p>
+        </w:tc>
+        <w:tc>
+          <w:tcPr>
+            <w:tcW w:type="dxa" w:w="1560"/>
+            <w:tcMar>
+              <w:top w:w="80" w:type="dxa"/>
+              <w:bottom w:w="80" w:type="dxa"/>
+              <w:left w:w="100" w:type="dxa"/>
+              <w:right w:w="100" w:type="dxa"/>
+            </w:tcMar>
+          </w:tcPr>
+          <w:p>
+            <w:pPr>
+              <w:spacing w:before="40" w:after="40" w:line="276" w:lineRule="auto"/>
+            </w:pPr>
+            <w:r>
+              <w:rPr>
+                <w:sz w:val="22"/>
+              </w:rPr>
+              <w:t>HTTP</w:t>
+            </w:r>
+          </w:p>
+        </w:tc>
+        <w:tc>
+          <w:tcPr>
+            <w:tcW w:type="dxa" w:w="1560"/>
+            <w:tcMar>
+              <w:top w:w="80" w:type="dxa"/>
+              <w:bottom w:w="80" w:type="dxa"/>
+              <w:left w:w="100" w:type="dxa"/>
+              <w:right w:w="100" w:type="dxa"/>
+            </w:tcMar>
+          </w:tcPr>
+          <w:p>
+            <w:pPr>
+              <w:spacing w:before="40" w:after="40" w:line="276" w:lineRule="auto"/>
+            </w:pPr>
+            <w:r>
+              <w:rPr>
+                <w:sz w:val="22"/>
+              </w:rPr>
+              <w:t>[http://localhost:3000](http://localhost:3000)</w:t>
+            </w:r>
+          </w:p>
+        </w:tc>
+        <w:tc>
+          <w:tcPr>
+            <w:tcW w:type="dxa" w:w="1560"/>
+            <w:tcMar>
+              <w:top w:w="80" w:type="dxa"/>
+              <w:bottom w:w="80" w:type="dxa"/>
+              <w:left w:w="100" w:type="dxa"/>
+              <w:right w:w="100" w:type="dxa"/>
+            </w:tcMar>
+          </w:tcPr>
+          <w:p>
+            <w:pPr>
+              <w:spacing w:before="40" w:after="40" w:line="276" w:lineRule="auto"/>
+            </w:pPr>
+            <w:r>
+              <w:rPr>
+                <w:sz w:val="22"/>
+              </w:rPr>
+              <w:t>Cổng Node.js Express trực tiếp (phục vụ kiểm thử và làm Upstream cho Nginx)</w:t>
+            </w:r>
+          </w:p>
+        </w:tc>
+      </w:tr>
+      <w:tr>
+        <w:tc>
+          <w:tcPr>
+            <w:tcW w:type="dxa" w:w="1560"/>
+            <w:tcMar>
+              <w:top w:w="80" w:type="dxa"/>
+              <w:bottom w:w="80" w:type="dxa"/>
+              <w:left w:w="100" w:type="dxa"/>
+              <w:right w:w="100" w:type="dxa"/>
+            </w:tcMar>
+          </w:tcPr>
+          <w:p>
+            <w:pPr>
+              <w:spacing w:before="40" w:after="40" w:line="276" w:lineRule="auto"/>
+            </w:pPr>
+            <w:r>
+              <w:rPr>
+                <w:sz w:val="22"/>
+              </w:rPr>
+              <w:t>**4**</w:t>
+            </w:r>
+          </w:p>
+        </w:tc>
+        <w:tc>
+          <w:tcPr>
+            <w:tcW w:type="dxa" w:w="1560"/>
+            <w:tcMar>
+              <w:top w:w="80" w:type="dxa"/>
+              <w:bottom w:w="80" w:type="dxa"/>
+              <w:left w:w="100" w:type="dxa"/>
+              <w:right w:w="100" w:type="dxa"/>
+            </w:tcMar>
+          </w:tcPr>
+          <w:p>
+            <w:pPr>
+              <w:spacing w:before="40" w:after="40" w:line="276" w:lineRule="auto"/>
+            </w:pPr>
+            <w:r>
+              <w:rPr>
+                <w:sz w:val="22"/>
+              </w:rPr>
+              <w:t>**Quản trị CSDL phpMyAdmin** (`sms-phpmyadmin`)</w:t>
+            </w:r>
+          </w:p>
+        </w:tc>
+        <w:tc>
+          <w:tcPr>
+            <w:tcW w:type="dxa" w:w="1560"/>
+            <w:tcMar>
+              <w:top w:w="80" w:type="dxa"/>
+              <w:bottom w:w="80" w:type="dxa"/>
+              <w:left w:w="100" w:type="dxa"/>
+              <w:right w:w="100" w:type="dxa"/>
+            </w:tcMar>
+          </w:tcPr>
+          <w:p>
+            <w:pPr>
+              <w:spacing w:before="40" w:after="40" w:line="276" w:lineRule="auto"/>
+            </w:pPr>
+            <w:r>
+              <w:rPr>
+                <w:sz w:val="22"/>
+              </w:rPr>
+              <w:t>**`8080`**</w:t>
+            </w:r>
+          </w:p>
+        </w:tc>
+        <w:tc>
+          <w:tcPr>
+            <w:tcW w:type="dxa" w:w="1560"/>
+            <w:tcMar>
+              <w:top w:w="80" w:type="dxa"/>
+              <w:bottom w:w="80" w:type="dxa"/>
+              <w:left w:w="100" w:type="dxa"/>
+              <w:right w:w="100" w:type="dxa"/>
+            </w:tcMar>
+          </w:tcPr>
+          <w:p>
+            <w:pPr>
+              <w:spacing w:before="40" w:after="40" w:line="276" w:lineRule="auto"/>
+            </w:pPr>
+            <w:r>
+              <w:rPr>
+                <w:sz w:val="22"/>
+              </w:rPr>
+              <w:t>HTTP</w:t>
+            </w:r>
+          </w:p>
+        </w:tc>
+        <w:tc>
+          <w:tcPr>
+            <w:tcW w:type="dxa" w:w="1560"/>
+            <w:tcMar>
+              <w:top w:w="80" w:type="dxa"/>
+              <w:bottom w:w="80" w:type="dxa"/>
+              <w:left w:w="100" w:type="dxa"/>
+              <w:right w:w="100" w:type="dxa"/>
+            </w:tcMar>
+          </w:tcPr>
+          <w:p>
+            <w:pPr>
+              <w:spacing w:before="40" w:after="40" w:line="276" w:lineRule="auto"/>
+            </w:pPr>
+            <w:r>
+              <w:rPr>
+                <w:sz w:val="22"/>
+              </w:rPr>
+              <w:t>[http://localhost:8080](http://localhost:8080)</w:t>
+            </w:r>
+          </w:p>
+        </w:tc>
+        <w:tc>
+          <w:tcPr>
+            <w:tcW w:type="dxa" w:w="1560"/>
+            <w:tcMar>
+              <w:top w:w="80" w:type="dxa"/>
+              <w:bottom w:w="80" w:type="dxa"/>
+              <w:left w:w="100" w:type="dxa"/>
+              <w:right w:w="100" w:type="dxa"/>
+            </w:tcMar>
+          </w:tcPr>
+          <w:p>
+            <w:pPr>
+              <w:spacing w:before="40" w:after="40" w:line="276" w:lineRule="auto"/>
+            </w:pPr>
+            <w:r>
+              <w:rPr>
+                <w:sz w:val="22"/>
+              </w:rPr>
+              <w:t>Giao diện đồ họa web quản trị CSDL MySQL (`student_user` / `SecurePass_2026@TKQTPM!`)</w:t>
+            </w:r>
+          </w:p>
+        </w:tc>
+      </w:tr>
+      <w:tr>
+        <w:tc>
+          <w:tcPr>
+            <w:tcW w:type="dxa" w:w="1560"/>
+            <w:tcMar>
+              <w:top w:w="80" w:type="dxa"/>
+              <w:bottom w:w="80" w:type="dxa"/>
+              <w:left w:w="100" w:type="dxa"/>
+              <w:right w:w="100" w:type="dxa"/>
+            </w:tcMar>
+          </w:tcPr>
+          <w:p>
+            <w:pPr>
+              <w:spacing w:before="40" w:after="40" w:line="276" w:lineRule="auto"/>
+            </w:pPr>
+            <w:r>
+              <w:rPr>
+                <w:sz w:val="22"/>
+              </w:rPr>
+              <w:t>**5**</w:t>
+            </w:r>
+          </w:p>
+        </w:tc>
+        <w:tc>
+          <w:tcPr>
+            <w:tcW w:type="dxa" w:w="1560"/>
+            <w:tcMar>
+              <w:top w:w="80" w:type="dxa"/>
+              <w:bottom w:w="80" w:type="dxa"/>
+              <w:left w:w="100" w:type="dxa"/>
+              <w:right w:w="100" w:type="dxa"/>
+            </w:tcMar>
+          </w:tcPr>
+          <w:p>
+            <w:pPr>
+              <w:spacing w:before="40" w:after="40" w:line="276" w:lineRule="auto"/>
+            </w:pPr>
+            <w:r>
+              <w:rPr>
+                <w:sz w:val="22"/>
+              </w:rPr>
+              <w:t>**Grafana Dashboard** (`sms-grafana`)</w:t>
+            </w:r>
+          </w:p>
+        </w:tc>
+        <w:tc>
+          <w:tcPr>
+            <w:tcW w:type="dxa" w:w="1560"/>
+            <w:tcMar>
+              <w:top w:w="80" w:type="dxa"/>
+              <w:bottom w:w="80" w:type="dxa"/>
+              <w:left w:w="100" w:type="dxa"/>
+              <w:right w:w="100" w:type="dxa"/>
+            </w:tcMar>
+          </w:tcPr>
+          <w:p>
+            <w:pPr>
+              <w:spacing w:before="40" w:after="40" w:line="276" w:lineRule="auto"/>
+            </w:pPr>
+            <w:r>
+              <w:rPr>
+                <w:sz w:val="22"/>
+              </w:rPr>
+              <w:t>**`3001`**</w:t>
+            </w:r>
+          </w:p>
+        </w:tc>
+        <w:tc>
+          <w:tcPr>
+            <w:tcW w:type="dxa" w:w="1560"/>
+            <w:tcMar>
+              <w:top w:w="80" w:type="dxa"/>
+              <w:bottom w:w="80" w:type="dxa"/>
+              <w:left w:w="100" w:type="dxa"/>
+              <w:right w:w="100" w:type="dxa"/>
+            </w:tcMar>
+          </w:tcPr>
+          <w:p>
+            <w:pPr>
+              <w:spacing w:before="40" w:after="40" w:line="276" w:lineRule="auto"/>
+            </w:pPr>
+            <w:r>
+              <w:rPr>
+                <w:sz w:val="22"/>
+              </w:rPr>
+              <w:t>HTTP</w:t>
+            </w:r>
+          </w:p>
+        </w:tc>
+        <w:tc>
+          <w:tcPr>
+            <w:tcW w:type="dxa" w:w="1560"/>
+            <w:tcMar>
+              <w:top w:w="80" w:type="dxa"/>
+              <w:bottom w:w="80" w:type="dxa"/>
+              <w:left w:w="100" w:type="dxa"/>
+              <w:right w:w="100" w:type="dxa"/>
+            </w:tcMar>
+          </w:tcPr>
+          <w:p>
+            <w:pPr>
+              <w:spacing w:before="40" w:after="40" w:line="276" w:lineRule="auto"/>
+            </w:pPr>
+            <w:r>
+              <w:rPr>
+                <w:sz w:val="22"/>
+              </w:rPr>
+              <w:t>[http://localhost:3001](http://localhost:3001)</w:t>
+            </w:r>
+          </w:p>
+        </w:tc>
+        <w:tc>
+          <w:tcPr>
+            <w:tcW w:type="dxa" w:w="1560"/>
+            <w:tcMar>
+              <w:top w:w="80" w:type="dxa"/>
+              <w:bottom w:w="80" w:type="dxa"/>
+              <w:left w:w="100" w:type="dxa"/>
+              <w:right w:w="100" w:type="dxa"/>
+            </w:tcMar>
+          </w:tcPr>
+          <w:p>
+            <w:pPr>
+              <w:spacing w:before="40" w:after="40" w:line="276" w:lineRule="auto"/>
+            </w:pPr>
+            <w:r>
+              <w:rPr>
+                <w:sz w:val="22"/>
+              </w:rPr>
+              <w:t>Bảng điều khiển giám sát tài nguyên CPU/RAM hệ thống và phân tích log tập trung (Loki LogQL)</w:t>
+            </w:r>
+          </w:p>
+        </w:tc>
+      </w:tr>
+      <w:tr>
+        <w:tc>
+          <w:tcPr>
+            <w:tcW w:type="dxa" w:w="1560"/>
+            <w:tcMar>
+              <w:top w:w="80" w:type="dxa"/>
+              <w:bottom w:w="80" w:type="dxa"/>
+              <w:left w:w="100" w:type="dxa"/>
+              <w:right w:w="100" w:type="dxa"/>
+            </w:tcMar>
+          </w:tcPr>
+          <w:p>
+            <w:pPr>
+              <w:spacing w:before="40" w:after="40" w:line="276" w:lineRule="auto"/>
+            </w:pPr>
+            <w:r>
+              <w:rPr>
+                <w:sz w:val="22"/>
+              </w:rPr>
+              <w:t>**6**</w:t>
+            </w:r>
+          </w:p>
+        </w:tc>
+        <w:tc>
+          <w:tcPr>
+            <w:tcW w:type="dxa" w:w="1560"/>
+            <w:tcMar>
+              <w:top w:w="80" w:type="dxa"/>
+              <w:bottom w:w="80" w:type="dxa"/>
+              <w:left w:w="100" w:type="dxa"/>
+              <w:right w:w="100" w:type="dxa"/>
+            </w:tcMar>
+          </w:tcPr>
+          <w:p>
+            <w:pPr>
+              <w:spacing w:before="40" w:after="40" w:line="276" w:lineRule="auto"/>
+            </w:pPr>
+            <w:r>
+              <w:rPr>
+                <w:sz w:val="22"/>
+              </w:rPr>
+              <w:t>**Prometheus Server** (`sms-prometheus`)</w:t>
+            </w:r>
+          </w:p>
+        </w:tc>
+        <w:tc>
+          <w:tcPr>
+            <w:tcW w:type="dxa" w:w="1560"/>
+            <w:tcMar>
+              <w:top w:w="80" w:type="dxa"/>
+              <w:bottom w:w="80" w:type="dxa"/>
+              <w:left w:w="100" w:type="dxa"/>
+              <w:right w:w="100" w:type="dxa"/>
+            </w:tcMar>
+          </w:tcPr>
+          <w:p>
+            <w:pPr>
+              <w:spacing w:before="40" w:after="40" w:line="276" w:lineRule="auto"/>
+            </w:pPr>
+            <w:r>
+              <w:rPr>
+                <w:sz w:val="22"/>
+              </w:rPr>
+              <w:t>**`9090`**</w:t>
+            </w:r>
+          </w:p>
+        </w:tc>
+        <w:tc>
+          <w:tcPr>
+            <w:tcW w:type="dxa" w:w="1560"/>
+            <w:tcMar>
+              <w:top w:w="80" w:type="dxa"/>
+              <w:bottom w:w="80" w:type="dxa"/>
+              <w:left w:w="100" w:type="dxa"/>
+              <w:right w:w="100" w:type="dxa"/>
+            </w:tcMar>
+          </w:tcPr>
+          <w:p>
+            <w:pPr>
+              <w:spacing w:before="40" w:after="40" w:line="276" w:lineRule="auto"/>
+            </w:pPr>
+            <w:r>
+              <w:rPr>
+                <w:sz w:val="22"/>
+              </w:rPr>
+              <w:t>HTTP</w:t>
+            </w:r>
+          </w:p>
+        </w:tc>
+        <w:tc>
+          <w:tcPr>
+            <w:tcW w:type="dxa" w:w="1560"/>
+            <w:tcMar>
+              <w:top w:w="80" w:type="dxa"/>
+              <w:bottom w:w="80" w:type="dxa"/>
+              <w:left w:w="100" w:type="dxa"/>
+              <w:right w:w="100" w:type="dxa"/>
+            </w:tcMar>
+          </w:tcPr>
+          <w:p>
+            <w:pPr>
+              <w:spacing w:before="40" w:after="40" w:line="276" w:lineRule="auto"/>
+            </w:pPr>
+            <w:r>
+              <w:rPr>
+                <w:sz w:val="22"/>
+              </w:rPr>
+              <w:t>[http://localhost:9090](http://localhost:9090)</w:t>
+            </w:r>
+          </w:p>
+        </w:tc>
+        <w:tc>
+          <w:tcPr>
+            <w:tcW w:type="dxa" w:w="1560"/>
+            <w:tcMar>
+              <w:top w:w="80" w:type="dxa"/>
+              <w:bottom w:w="80" w:type="dxa"/>
+              <w:left w:w="100" w:type="dxa"/>
+              <w:right w:w="100" w:type="dxa"/>
+            </w:tcMar>
+          </w:tcPr>
+          <w:p>
+            <w:pPr>
+              <w:spacing w:before="40" w:after="40" w:line="276" w:lineRule="auto"/>
+            </w:pPr>
+            <w:r>
+              <w:rPr>
+                <w:sz w:val="22"/>
+              </w:rPr>
+              <w:t>Máy chủ thu thập, lưu trữ Time-Series Metrics và quản lý các targets (`/targets`)</w:t>
+            </w:r>
+          </w:p>
+        </w:tc>
+      </w:tr>
+      <w:tr>
+        <w:tc>
+          <w:tcPr>
+            <w:tcW w:type="dxa" w:w="1560"/>
+            <w:tcMar>
+              <w:top w:w="80" w:type="dxa"/>
+              <w:bottom w:w="80" w:type="dxa"/>
+              <w:left w:w="100" w:type="dxa"/>
+              <w:right w:w="100" w:type="dxa"/>
+            </w:tcMar>
+          </w:tcPr>
+          <w:p>
+            <w:pPr>
+              <w:spacing w:before="40" w:after="40" w:line="276" w:lineRule="auto"/>
+            </w:pPr>
+            <w:r>
+              <w:rPr>
+                <w:sz w:val="22"/>
+              </w:rPr>
+              <w:t>**7**</w:t>
+            </w:r>
+          </w:p>
+        </w:tc>
+        <w:tc>
+          <w:tcPr>
+            <w:tcW w:type="dxa" w:w="1560"/>
+            <w:tcMar>
+              <w:top w:w="80" w:type="dxa"/>
+              <w:bottom w:w="80" w:type="dxa"/>
+              <w:left w:w="100" w:type="dxa"/>
+              <w:right w:w="100" w:type="dxa"/>
+            </w:tcMar>
+          </w:tcPr>
+          <w:p>
+            <w:pPr>
+              <w:spacing w:before="40" w:after="40" w:line="276" w:lineRule="auto"/>
+            </w:pPr>
+            <w:r>
+              <w:rPr>
+                <w:sz w:val="22"/>
+              </w:rPr>
+              <w:t>**Grafana Loki API** (`sms-loki`)</w:t>
+            </w:r>
+          </w:p>
+        </w:tc>
+        <w:tc>
+          <w:tcPr>
+            <w:tcW w:type="dxa" w:w="1560"/>
+            <w:tcMar>
+              <w:top w:w="80" w:type="dxa"/>
+              <w:bottom w:w="80" w:type="dxa"/>
+              <w:left w:w="100" w:type="dxa"/>
+              <w:right w:w="100" w:type="dxa"/>
+            </w:tcMar>
+          </w:tcPr>
+          <w:p>
+            <w:pPr>
+              <w:spacing w:before="40" w:after="40" w:line="276" w:lineRule="auto"/>
+            </w:pPr>
+            <w:r>
+              <w:rPr>
+                <w:sz w:val="22"/>
+              </w:rPr>
+              <w:t>**`3100`**</w:t>
+            </w:r>
+          </w:p>
+        </w:tc>
+        <w:tc>
+          <w:tcPr>
+            <w:tcW w:type="dxa" w:w="1560"/>
+            <w:tcMar>
+              <w:top w:w="80" w:type="dxa"/>
+              <w:bottom w:w="80" w:type="dxa"/>
+              <w:left w:w="100" w:type="dxa"/>
+              <w:right w:w="100" w:type="dxa"/>
+            </w:tcMar>
+          </w:tcPr>
+          <w:p>
+            <w:pPr>
+              <w:spacing w:before="40" w:after="40" w:line="276" w:lineRule="auto"/>
+            </w:pPr>
+            <w:r>
+              <w:rPr>
+                <w:sz w:val="22"/>
+              </w:rPr>
+              <w:t>HTTP</w:t>
+            </w:r>
+          </w:p>
+        </w:tc>
+        <w:tc>
+          <w:tcPr>
+            <w:tcW w:type="dxa" w:w="1560"/>
+            <w:tcMar>
+              <w:top w:w="80" w:type="dxa"/>
+              <w:bottom w:w="80" w:type="dxa"/>
+              <w:left w:w="100" w:type="dxa"/>
+              <w:right w:w="100" w:type="dxa"/>
+            </w:tcMar>
+          </w:tcPr>
+          <w:p>
+            <w:pPr>
+              <w:spacing w:before="40" w:after="40" w:line="276" w:lineRule="auto"/>
+            </w:pPr>
+            <w:r>
+              <w:rPr>
+                <w:sz w:val="22"/>
+              </w:rPr>
+              <w:t>[http://localhost:3100](http://localhost:3100)</w:t>
+            </w:r>
+          </w:p>
+        </w:tc>
+        <w:tc>
+          <w:tcPr>
+            <w:tcW w:type="dxa" w:w="1560"/>
+            <w:tcMar>
+              <w:top w:w="80" w:type="dxa"/>
+              <w:bottom w:w="80" w:type="dxa"/>
+              <w:left w:w="100" w:type="dxa"/>
+              <w:right w:w="100" w:type="dxa"/>
+            </w:tcMar>
+          </w:tcPr>
+          <w:p>
+            <w:pPr>
+              <w:spacing w:before="40" w:after="40" w:line="276" w:lineRule="auto"/>
+            </w:pPr>
+            <w:r>
+              <w:rPr>
+                <w:sz w:val="22"/>
+              </w:rPr>
+              <w:t>API máy chủ tiếp nhận, đánh chỉ mục và lưu trữ Log tập trung từ Promtail</w:t>
+            </w:r>
+          </w:p>
+        </w:tc>
+      </w:tr>
+      <w:tr>
+        <w:tc>
+          <w:tcPr>
+            <w:tcW w:type="dxa" w:w="1560"/>
+            <w:tcMar>
+              <w:top w:w="80" w:type="dxa"/>
+              <w:bottom w:w="80" w:type="dxa"/>
+              <w:left w:w="100" w:type="dxa"/>
+              <w:right w:w="100" w:type="dxa"/>
+            </w:tcMar>
+          </w:tcPr>
+          <w:p>
+            <w:pPr>
+              <w:spacing w:before="40" w:after="40" w:line="276" w:lineRule="auto"/>
+            </w:pPr>
+            <w:r>
+              <w:rPr>
+                <w:sz w:val="22"/>
+              </w:rPr>
+              <w:t>**8**</w:t>
+            </w:r>
+          </w:p>
+        </w:tc>
+        <w:tc>
+          <w:tcPr>
+            <w:tcW w:type="dxa" w:w="1560"/>
+            <w:tcMar>
+              <w:top w:w="80" w:type="dxa"/>
+              <w:bottom w:w="80" w:type="dxa"/>
+              <w:left w:w="100" w:type="dxa"/>
+              <w:right w:w="100" w:type="dxa"/>
+            </w:tcMar>
+          </w:tcPr>
+          <w:p>
+            <w:pPr>
+              <w:spacing w:before="40" w:after="40" w:line="276" w:lineRule="auto"/>
+            </w:pPr>
+            <w:r>
+              <w:rPr>
+                <w:sz w:val="22"/>
+              </w:rPr>
+              <w:t>**Healthcheck Web App** (`sms-app`)</w:t>
+            </w:r>
+          </w:p>
+        </w:tc>
+        <w:tc>
+          <w:tcPr>
+            <w:tcW w:type="dxa" w:w="1560"/>
+            <w:tcMar>
+              <w:top w:w="80" w:type="dxa"/>
+              <w:bottom w:w="80" w:type="dxa"/>
+              <w:left w:w="100" w:type="dxa"/>
+              <w:right w:w="100" w:type="dxa"/>
+            </w:tcMar>
+          </w:tcPr>
+          <w:p>
+            <w:pPr>
+              <w:spacing w:before="40" w:after="40" w:line="276" w:lineRule="auto"/>
+            </w:pPr>
+            <w:r>
+              <w:rPr>
+                <w:sz w:val="22"/>
+              </w:rPr>
+              <w:t>**`3000`**</w:t>
+            </w:r>
+          </w:p>
+        </w:tc>
+        <w:tc>
+          <w:tcPr>
+            <w:tcW w:type="dxa" w:w="1560"/>
+            <w:tcMar>
+              <w:top w:w="80" w:type="dxa"/>
+              <w:bottom w:w="80" w:type="dxa"/>
+              <w:left w:w="100" w:type="dxa"/>
+              <w:right w:w="100" w:type="dxa"/>
+            </w:tcMar>
+          </w:tcPr>
+          <w:p>
+            <w:pPr>
+              <w:spacing w:before="40" w:after="40" w:line="276" w:lineRule="auto"/>
+            </w:pPr>
+            <w:r>
+              <w:rPr>
+                <w:sz w:val="22"/>
+              </w:rPr>
+              <w:t>HTTP</w:t>
+            </w:r>
+          </w:p>
+        </w:tc>
+        <w:tc>
+          <w:tcPr>
+            <w:tcW w:type="dxa" w:w="1560"/>
+            <w:tcMar>
+              <w:top w:w="80" w:type="dxa"/>
+              <w:bottom w:w="80" w:type="dxa"/>
+              <w:left w:w="100" w:type="dxa"/>
+              <w:right w:w="100" w:type="dxa"/>
+            </w:tcMar>
+          </w:tcPr>
+          <w:p>
+            <w:pPr>
+              <w:spacing w:before="40" w:after="40" w:line="276" w:lineRule="auto"/>
+            </w:pPr>
+            <w:r>
+              <w:rPr>
+                <w:sz w:val="22"/>
+              </w:rPr>
+              <w:t>[http://localhost:3000/health](http://localhost:3000/health)</w:t>
+            </w:r>
+          </w:p>
+        </w:tc>
+        <w:tc>
+          <w:tcPr>
+            <w:tcW w:type="dxa" w:w="1560"/>
+            <w:tcMar>
+              <w:top w:w="80" w:type="dxa"/>
+              <w:bottom w:w="80" w:type="dxa"/>
+              <w:left w:w="100" w:type="dxa"/>
+              <w:right w:w="100" w:type="dxa"/>
+            </w:tcMar>
+          </w:tcPr>
+          <w:p>
+            <w:pPr>
+              <w:spacing w:before="40" w:after="40" w:line="276" w:lineRule="auto"/>
+            </w:pPr>
+            <w:r>
+              <w:rPr>
+                <w:sz w:val="22"/>
+              </w:rPr>
+              <w:t>API JSON kiểm tra trạng thái hoạt động (Liveness / Readiness) của dịch vụ Web</w:t>
+            </w:r>
+          </w:p>
+        </w:tc>
+      </w:tr>
+      <w:tr>
+        <w:tc>
+          <w:tcPr>
+            <w:tcW w:type="dxa" w:w="1560"/>
+            <w:tcMar>
+              <w:top w:w="80" w:type="dxa"/>
+              <w:bottom w:w="80" w:type="dxa"/>
+              <w:left w:w="100" w:type="dxa"/>
+              <w:right w:w="100" w:type="dxa"/>
+            </w:tcMar>
+          </w:tcPr>
+          <w:p>
+            <w:pPr>
+              <w:spacing w:before="40" w:after="40" w:line="276" w:lineRule="auto"/>
+            </w:pPr>
+            <w:r>
+              <w:rPr>
+                <w:sz w:val="22"/>
+              </w:rPr>
+              <w:t>**9**</w:t>
+            </w:r>
+          </w:p>
+        </w:tc>
+        <w:tc>
+          <w:tcPr>
+            <w:tcW w:type="dxa" w:w="1560"/>
+            <w:tcMar>
+              <w:top w:w="80" w:type="dxa"/>
+              <w:bottom w:w="80" w:type="dxa"/>
+              <w:left w:w="100" w:type="dxa"/>
+              <w:right w:w="100" w:type="dxa"/>
+            </w:tcMar>
+          </w:tcPr>
+          <w:p>
+            <w:pPr>
+              <w:spacing w:before="40" w:after="40" w:line="276" w:lineRule="auto"/>
+            </w:pPr>
+            <w:r>
+              <w:rPr>
+                <w:sz w:val="22"/>
+              </w:rPr>
+              <w:t>**Metrics Web App** (`sms-app`)</w:t>
+            </w:r>
+          </w:p>
+        </w:tc>
+        <w:tc>
+          <w:tcPr>
+            <w:tcW w:type="dxa" w:w="1560"/>
+            <w:tcMar>
+              <w:top w:w="80" w:type="dxa"/>
+              <w:bottom w:w="80" w:type="dxa"/>
+              <w:left w:w="100" w:type="dxa"/>
+              <w:right w:w="100" w:type="dxa"/>
+            </w:tcMar>
+          </w:tcPr>
+          <w:p>
+            <w:pPr>
+              <w:spacing w:before="40" w:after="40" w:line="276" w:lineRule="auto"/>
+            </w:pPr>
+            <w:r>
+              <w:rPr>
+                <w:sz w:val="22"/>
+              </w:rPr>
+              <w:t>**`3000`**</w:t>
+            </w:r>
+          </w:p>
+        </w:tc>
+        <w:tc>
+          <w:tcPr>
+            <w:tcW w:type="dxa" w:w="1560"/>
+            <w:tcMar>
+              <w:top w:w="80" w:type="dxa"/>
+              <w:bottom w:w="80" w:type="dxa"/>
+              <w:left w:w="100" w:type="dxa"/>
+              <w:right w:w="100" w:type="dxa"/>
+            </w:tcMar>
+          </w:tcPr>
+          <w:p>
+            <w:pPr>
+              <w:spacing w:before="40" w:after="40" w:line="276" w:lineRule="auto"/>
+            </w:pPr>
+            <w:r>
+              <w:rPr>
+                <w:sz w:val="22"/>
+              </w:rPr>
+              <w:t>HTTP</w:t>
+            </w:r>
+          </w:p>
+        </w:tc>
+        <w:tc>
+          <w:tcPr>
+            <w:tcW w:type="dxa" w:w="1560"/>
+            <w:tcMar>
+              <w:top w:w="80" w:type="dxa"/>
+              <w:bottom w:w="80" w:type="dxa"/>
+              <w:left w:w="100" w:type="dxa"/>
+              <w:right w:w="100" w:type="dxa"/>
+            </w:tcMar>
+          </w:tcPr>
+          <w:p>
+            <w:pPr>
+              <w:spacing w:before="40" w:after="40" w:line="276" w:lineRule="auto"/>
+            </w:pPr>
+            <w:r>
+              <w:rPr>
+                <w:sz w:val="22"/>
+              </w:rPr>
+              <w:t>[http://localhost:3000/metrics](http://localhost:3000/metrics)</w:t>
+            </w:r>
+          </w:p>
+        </w:tc>
+        <w:tc>
+          <w:tcPr>
+            <w:tcW w:type="dxa" w:w="1560"/>
+            <w:tcMar>
+              <w:top w:w="80" w:type="dxa"/>
+              <w:bottom w:w="80" w:type="dxa"/>
+              <w:left w:w="100" w:type="dxa"/>
+              <w:right w:w="100" w:type="dxa"/>
+            </w:tcMar>
+          </w:tcPr>
+          <w:p>
+            <w:pPr>
+              <w:spacing w:before="40" w:after="40" w:line="276" w:lineRule="auto"/>
+            </w:pPr>
+            <w:r>
+              <w:rPr>
+                <w:sz w:val="22"/>
+              </w:rPr>
+              <w:t>Prometheus Scrape Target cung cấp chỉ số HTTP traffic đo lường nội bộ ứng dụng</w:t>
+            </w:r>
+          </w:p>
+        </w:tc>
+      </w:tr>
+    </w:tbl>
+    <w:p>
+      <w:pPr>
+        <w:spacing w:before="120" w:after="40"/>
+      </w:pPr>
+      <w:r>
+        <w:rPr>
+          <w:b/>
+          <w:color w:val="334155"/>
+          <w:sz w:val="26"/>
+        </w:rPr>
+        <w:t>Bảng các cổng dịch vụ nội bộ (Network Isolation - Hardening):</w:t>
+      </w:r>
+    </w:p>
+    <w:tbl>
+      <w:tblPr>
+        <w:tblW w:type="auto" w:w="0"/>
+        <w:jc w:val="center"/>
+        <w:tblLook w:firstColumn="1" w:firstRow="1" w:lastColumn="0" w:lastRow="0" w:noHBand="0" w:noVBand="1" w:val="04A0"/>
+        <w:tblBorders>
+          <w:top w:val="single" w:sz="4" w:space="0" w:color="94A3B8"/>
+          <w:bottom w:val="single" w:sz="4" w:space="0" w:color="94A3B8"/>
+          <w:insideH w:val="single" w:sz="4" w:space="0" w:color="CBD5E1"/>
+          <w:insideV w:val="none"/>
+        </w:tblBorders>
+      </w:tblPr>
+      <w:tblGrid>
+        <w:gridCol w:w="1872"/>
+        <w:gridCol w:w="1872"/>
+        <w:gridCol w:w="1872"/>
+        <w:gridCol w:w="1872"/>
+        <w:gridCol w:w="1872"/>
+      </w:tblGrid>
+      <w:tr>
+        <w:tc>
+          <w:tcPr>
+            <w:tcW w:type="dxa" w:w="1872"/>
+            <w:tcMar>
+              <w:top w:w="80" w:type="dxa"/>
+              <w:bottom w:w="80" w:type="dxa"/>
+              <w:left w:w="100" w:type="dxa"/>
+              <w:right w:w="100" w:type="dxa"/>
+            </w:tcMar>
+            <w:shd w:fill="E2E8F0"/>
+          </w:tcPr>
+          <w:p>
+            <w:pPr>
+              <w:spacing w:before="40" w:after="40" w:line="276" w:lineRule="auto"/>
+            </w:pPr>
+            <w:r>
+              <w:rPr>
+                <w:b/>
+                <w:sz w:val="22"/>
+              </w:rPr>
+              <w:t>STT</w:t>
+            </w:r>
+          </w:p>
+        </w:tc>
+        <w:tc>
+          <w:tcPr>
+            <w:tcW w:type="dxa" w:w="1872"/>
+            <w:tcMar>
+              <w:top w:w="80" w:type="dxa"/>
+              <w:bottom w:w="80" w:type="dxa"/>
+              <w:left w:w="100" w:type="dxa"/>
+              <w:right w:w="100" w:type="dxa"/>
+            </w:tcMar>
+            <w:shd w:fill="E2E8F0"/>
+          </w:tcPr>
+          <w:p>
+            <w:pPr>
+              <w:spacing w:before="40" w:after="40" w:line="276" w:lineRule="auto"/>
+            </w:pPr>
+            <w:r>
+              <w:rPr>
+                <w:b/>
+                <w:sz w:val="22"/>
+              </w:rPr>
+              <w:t>Tên Dịch Vụ (Container)</w:t>
+            </w:r>
+          </w:p>
+        </w:tc>
+        <w:tc>
+          <w:tcPr>
+            <w:tcW w:type="dxa" w:w="1872"/>
+            <w:tcMar>
+              <w:top w:w="80" w:type="dxa"/>
+              <w:bottom w:w="80" w:type="dxa"/>
+              <w:left w:w="100" w:type="dxa"/>
+              <w:right w:w="100" w:type="dxa"/>
+            </w:tcMar>
+            <w:shd w:fill="E2E8F0"/>
+          </w:tcPr>
+          <w:p>
+            <w:pPr>
+              <w:spacing w:before="40" w:after="40" w:line="276" w:lineRule="auto"/>
+            </w:pPr>
+            <w:r>
+              <w:rPr>
+                <w:b/>
+                <w:sz w:val="22"/>
+              </w:rPr>
+              <w:t>Cổng Container</w:t>
+            </w:r>
+          </w:p>
+        </w:tc>
+        <w:tc>
+          <w:tcPr>
+            <w:tcW w:type="dxa" w:w="1872"/>
+            <w:tcMar>
+              <w:top w:w="80" w:type="dxa"/>
+              <w:bottom w:w="80" w:type="dxa"/>
+              <w:left w:w="100" w:type="dxa"/>
+              <w:right w:w="100" w:type="dxa"/>
+            </w:tcMar>
+            <w:shd w:fill="E2E8F0"/>
+          </w:tcPr>
+          <w:p>
+            <w:pPr>
+              <w:spacing w:before="40" w:after="40" w:line="276" w:lineRule="auto"/>
+            </w:pPr>
+            <w:r>
+              <w:rPr>
+                <w:b/>
+                <w:sz w:val="22"/>
+              </w:rPr>
+              <w:t>Mạng nội bộ</w:t>
+            </w:r>
+          </w:p>
+        </w:tc>
+        <w:tc>
+          <w:tcPr>
+            <w:tcW w:type="dxa" w:w="1872"/>
+            <w:tcMar>
+              <w:top w:w="80" w:type="dxa"/>
+              <w:bottom w:w="80" w:type="dxa"/>
+              <w:left w:w="100" w:type="dxa"/>
+              <w:right w:w="100" w:type="dxa"/>
+            </w:tcMar>
+            <w:shd w:fill="E2E8F0"/>
+          </w:tcPr>
+          <w:p>
+            <w:pPr>
+              <w:spacing w:before="40" w:after="40" w:line="276" w:lineRule="auto"/>
+            </w:pPr>
+            <w:r>
+              <w:rPr>
+                <w:b/>
+                <w:sz w:val="22"/>
+              </w:rPr>
+              <w:t>Cơ chế bảo vệ và Phân vùng an ninh</w:t>
+            </w:r>
+          </w:p>
+        </w:tc>
+      </w:tr>
+      <w:tr>
+        <w:tc>
+          <w:tcPr>
+            <w:tcW w:type="dxa" w:w="1872"/>
+            <w:tcMar>
+              <w:top w:w="80" w:type="dxa"/>
+              <w:bottom w:w="80" w:type="dxa"/>
+              <w:left w:w="100" w:type="dxa"/>
+              <w:right w:w="100" w:type="dxa"/>
+            </w:tcMar>
+          </w:tcPr>
+          <w:p>
+            <w:pPr>
+              <w:spacing w:before="40" w:after="40" w:line="276" w:lineRule="auto"/>
+            </w:pPr>
+            <w:r>
+              <w:rPr>
+                <w:sz w:val="22"/>
+              </w:rPr>
+              <w:t>**1**</w:t>
+            </w:r>
+          </w:p>
+        </w:tc>
+        <w:tc>
+          <w:tcPr>
+            <w:tcW w:type="dxa" w:w="1872"/>
+            <w:tcMar>
+              <w:top w:w="80" w:type="dxa"/>
+              <w:bottom w:w="80" w:type="dxa"/>
+              <w:left w:w="100" w:type="dxa"/>
+              <w:right w:w="100" w:type="dxa"/>
+            </w:tcMar>
+          </w:tcPr>
+          <w:p>
+            <w:pPr>
+              <w:spacing w:before="40" w:after="40" w:line="276" w:lineRule="auto"/>
+            </w:pPr>
+            <w:r>
+              <w:rPr>
+                <w:sz w:val="22"/>
+              </w:rPr>
+              <w:t>**MySQL Database 8.0** (`sms-mysql`)</w:t>
+            </w:r>
+          </w:p>
+        </w:tc>
+        <w:tc>
+          <w:tcPr>
+            <w:tcW w:type="dxa" w:w="1872"/>
+            <w:tcMar>
+              <w:top w:w="80" w:type="dxa"/>
+              <w:bottom w:w="80" w:type="dxa"/>
+              <w:left w:w="100" w:type="dxa"/>
+              <w:right w:w="100" w:type="dxa"/>
+            </w:tcMar>
+          </w:tcPr>
+          <w:p>
+            <w:pPr>
+              <w:spacing w:before="40" w:after="40" w:line="276" w:lineRule="auto"/>
+            </w:pPr>
+            <w:r>
+              <w:rPr>
+                <w:sz w:val="22"/>
+              </w:rPr>
+              <w:t>`3306`</w:t>
+            </w:r>
+          </w:p>
+        </w:tc>
+        <w:tc>
+          <w:tcPr>
+            <w:tcW w:type="dxa" w:w="1872"/>
+            <w:tcMar>
+              <w:top w:w="80" w:type="dxa"/>
+              <w:bottom w:w="80" w:type="dxa"/>
+              <w:left w:w="100" w:type="dxa"/>
+              <w:right w:w="100" w:type="dxa"/>
+            </w:tcMar>
+          </w:tcPr>
+          <w:p>
+            <w:pPr>
+              <w:spacing w:before="40" w:after="40" w:line="276" w:lineRule="auto"/>
+            </w:pPr>
+            <w:r>
+              <w:rPr>
+                <w:sz w:val="22"/>
+              </w:rPr>
+              <w:t>`backend-net`</w:t>
+            </w:r>
+          </w:p>
+        </w:tc>
+        <w:tc>
+          <w:tcPr>
+            <w:tcW w:type="dxa" w:w="1872"/>
+            <w:tcMar>
+              <w:top w:w="80" w:type="dxa"/>
+              <w:bottom w:w="80" w:type="dxa"/>
+              <w:left w:w="100" w:type="dxa"/>
+              <w:right w:w="100" w:type="dxa"/>
+            </w:tcMar>
+          </w:tcPr>
+          <w:p>
+            <w:pPr>
+              <w:spacing w:before="40" w:after="40" w:line="276" w:lineRule="auto"/>
+            </w:pPr>
+            <w:r>
+              <w:rPr>
+                <w:sz w:val="22"/>
+              </w:rPr>
+              <w:t>**Hardening:** Cổng 3306 hoàn toàn không mở ra Host, chỉ cho phép container `app` và `phpmyadmin` truy cập nội bộ.</w:t>
+            </w:r>
+          </w:p>
+        </w:tc>
+      </w:tr>
+      <w:tr>
+        <w:tc>
+          <w:tcPr>
+            <w:tcW w:type="dxa" w:w="1872"/>
+            <w:tcMar>
+              <w:top w:w="80" w:type="dxa"/>
+              <w:bottom w:w="80" w:type="dxa"/>
+              <w:left w:w="100" w:type="dxa"/>
+              <w:right w:w="100" w:type="dxa"/>
+            </w:tcMar>
+          </w:tcPr>
+          <w:p>
+            <w:pPr>
+              <w:spacing w:before="40" w:after="40" w:line="276" w:lineRule="auto"/>
+            </w:pPr>
+            <w:r>
+              <w:rPr>
+                <w:sz w:val="22"/>
+              </w:rPr>
+              <w:t>**2**</w:t>
+            </w:r>
+          </w:p>
+        </w:tc>
+        <w:tc>
+          <w:tcPr>
+            <w:tcW w:type="dxa" w:w="1872"/>
+            <w:tcMar>
+              <w:top w:w="80" w:type="dxa"/>
+              <w:bottom w:w="80" w:type="dxa"/>
+              <w:left w:w="100" w:type="dxa"/>
+              <w:right w:w="100" w:type="dxa"/>
+            </w:tcMar>
+          </w:tcPr>
+          <w:p>
+            <w:pPr>
+              <w:spacing w:before="40" w:after="40" w:line="276" w:lineRule="auto"/>
+            </w:pPr>
+            <w:r>
+              <w:rPr>
+                <w:sz w:val="22"/>
+              </w:rPr>
+              <w:t>**cAdvisor** (`sms-cadvisor`)</w:t>
+            </w:r>
+          </w:p>
+        </w:tc>
+        <w:tc>
+          <w:tcPr>
+            <w:tcW w:type="dxa" w:w="1872"/>
+            <w:tcMar>
+              <w:top w:w="80" w:type="dxa"/>
+              <w:bottom w:w="80" w:type="dxa"/>
+              <w:left w:w="100" w:type="dxa"/>
+              <w:right w:w="100" w:type="dxa"/>
+            </w:tcMar>
+          </w:tcPr>
+          <w:p>
+            <w:pPr>
+              <w:spacing w:before="40" w:after="40" w:line="276" w:lineRule="auto"/>
+            </w:pPr>
+            <w:r>
+              <w:rPr>
+                <w:sz w:val="22"/>
+              </w:rPr>
+              <w:t>`8080`</w:t>
+            </w:r>
+          </w:p>
+        </w:tc>
+        <w:tc>
+          <w:tcPr>
+            <w:tcW w:type="dxa" w:w="1872"/>
+            <w:tcMar>
+              <w:top w:w="80" w:type="dxa"/>
+              <w:bottom w:w="80" w:type="dxa"/>
+              <w:left w:w="100" w:type="dxa"/>
+              <w:right w:w="100" w:type="dxa"/>
+            </w:tcMar>
+          </w:tcPr>
+          <w:p>
+            <w:pPr>
+              <w:spacing w:before="40" w:after="40" w:line="276" w:lineRule="auto"/>
+            </w:pPr>
+            <w:r>
+              <w:rPr>
+                <w:sz w:val="22"/>
+              </w:rPr>
+              <w:t>`monitoring-net`</w:t>
+            </w:r>
+          </w:p>
+        </w:tc>
+        <w:tc>
+          <w:tcPr>
+            <w:tcW w:type="dxa" w:w="1872"/>
+            <w:tcMar>
+              <w:top w:w="80" w:type="dxa"/>
+              <w:bottom w:w="80" w:type="dxa"/>
+              <w:left w:w="100" w:type="dxa"/>
+              <w:right w:w="100" w:type="dxa"/>
+            </w:tcMar>
+          </w:tcPr>
+          <w:p>
+            <w:pPr>
+              <w:spacing w:before="40" w:after="40" w:line="276" w:lineRule="auto"/>
+            </w:pPr>
+            <w:r>
+              <w:rPr>
+                <w:sz w:val="22"/>
+              </w:rPr>
+              <w:t>Xuất thông số tài nguyên CPU, RAM, Network của 11 container cho Prometheus (`http://cadvisor:8080/metrics`).</w:t>
+            </w:r>
+          </w:p>
+        </w:tc>
+      </w:tr>
+      <w:tr>
+        <w:tc>
+          <w:tcPr>
+            <w:tcW w:type="dxa" w:w="1872"/>
+            <w:tcMar>
+              <w:top w:w="80" w:type="dxa"/>
+              <w:bottom w:w="80" w:type="dxa"/>
+              <w:left w:w="100" w:type="dxa"/>
+              <w:right w:w="100" w:type="dxa"/>
+            </w:tcMar>
+          </w:tcPr>
+          <w:p>
+            <w:pPr>
+              <w:spacing w:before="40" w:after="40" w:line="276" w:lineRule="auto"/>
+            </w:pPr>
+            <w:r>
+              <w:rPr>
+                <w:sz w:val="22"/>
+              </w:rPr>
+              <w:t>**3**</w:t>
+            </w:r>
+          </w:p>
+        </w:tc>
+        <w:tc>
+          <w:tcPr>
+            <w:tcW w:type="dxa" w:w="1872"/>
+            <w:tcMar>
+              <w:top w:w="80" w:type="dxa"/>
+              <w:bottom w:w="80" w:type="dxa"/>
+              <w:left w:w="100" w:type="dxa"/>
+              <w:right w:w="100" w:type="dxa"/>
+            </w:tcMar>
+          </w:tcPr>
+          <w:p>
+            <w:pPr>
+              <w:spacing w:before="40" w:after="40" w:line="276" w:lineRule="auto"/>
+            </w:pPr>
+            <w:r>
+              <w:rPr>
+                <w:sz w:val="22"/>
+              </w:rPr>
+              <w:t>**Nginx Exporter** (`sms-nginx-exporter`)</w:t>
+            </w:r>
+          </w:p>
+        </w:tc>
+        <w:tc>
+          <w:tcPr>
+            <w:tcW w:type="dxa" w:w="1872"/>
+            <w:tcMar>
+              <w:top w:w="80" w:type="dxa"/>
+              <w:bottom w:w="80" w:type="dxa"/>
+              <w:left w:w="100" w:type="dxa"/>
+              <w:right w:w="100" w:type="dxa"/>
+            </w:tcMar>
+          </w:tcPr>
+          <w:p>
+            <w:pPr>
+              <w:spacing w:before="40" w:after="40" w:line="276" w:lineRule="auto"/>
+            </w:pPr>
+            <w:r>
+              <w:rPr>
+                <w:sz w:val="22"/>
+              </w:rPr>
+              <w:t>`9113`</w:t>
+            </w:r>
+          </w:p>
+        </w:tc>
+        <w:tc>
+          <w:tcPr>
+            <w:tcW w:type="dxa" w:w="1872"/>
+            <w:tcMar>
+              <w:top w:w="80" w:type="dxa"/>
+              <w:bottom w:w="80" w:type="dxa"/>
+              <w:left w:w="100" w:type="dxa"/>
+              <w:right w:w="100" w:type="dxa"/>
+            </w:tcMar>
+          </w:tcPr>
+          <w:p>
+            <w:pPr>
+              <w:spacing w:before="40" w:after="40" w:line="276" w:lineRule="auto"/>
+            </w:pPr>
+            <w:r>
+              <w:rPr>
+                <w:sz w:val="22"/>
+              </w:rPr>
+              <w:t>`monitoring-net`</w:t>
+            </w:r>
+          </w:p>
+        </w:tc>
+        <w:tc>
+          <w:tcPr>
+            <w:tcW w:type="dxa" w:w="1872"/>
+            <w:tcMar>
+              <w:top w:w="80" w:type="dxa"/>
+              <w:bottom w:w="80" w:type="dxa"/>
+              <w:left w:w="100" w:type="dxa"/>
+              <w:right w:w="100" w:type="dxa"/>
+            </w:tcMar>
+          </w:tcPr>
+          <w:p>
+            <w:pPr>
+              <w:spacing w:before="40" w:after="40" w:line="276" w:lineRule="auto"/>
+            </w:pPr>
+            <w:r>
+              <w:rPr>
+                <w:sz w:val="22"/>
+              </w:rPr>
+              <w:t>Đọc chỉ số stub_status từ Nginx và xuất metrics cho Prometheus (`http://nginx-exporter:9113/metrics`).</w:t>
+            </w:r>
+          </w:p>
+        </w:tc>
+      </w:tr>
+      <w:tr>
+        <w:tc>
+          <w:tcPr>
+            <w:tcW w:type="dxa" w:w="1872"/>
+            <w:tcMar>
+              <w:top w:w="80" w:type="dxa"/>
+              <w:bottom w:w="80" w:type="dxa"/>
+              <w:left w:w="100" w:type="dxa"/>
+              <w:right w:w="100" w:type="dxa"/>
+            </w:tcMar>
+          </w:tcPr>
+          <w:p>
+            <w:pPr>
+              <w:spacing w:before="40" w:after="40" w:line="276" w:lineRule="auto"/>
+            </w:pPr>
+            <w:r>
+              <w:rPr>
+                <w:sz w:val="22"/>
+              </w:rPr>
+              <w:t>**4**</w:t>
+            </w:r>
+          </w:p>
+        </w:tc>
+        <w:tc>
+          <w:tcPr>
+            <w:tcW w:type="dxa" w:w="1872"/>
+            <w:tcMar>
+              <w:top w:w="80" w:type="dxa"/>
+              <w:bottom w:w="80" w:type="dxa"/>
+              <w:left w:w="100" w:type="dxa"/>
+              <w:right w:w="100" w:type="dxa"/>
+            </w:tcMar>
+          </w:tcPr>
+          <w:p>
+            <w:pPr>
+              <w:spacing w:before="40" w:after="40" w:line="276" w:lineRule="auto"/>
+            </w:pPr>
+            <w:r>
+              <w:rPr>
+                <w:sz w:val="22"/>
+              </w:rPr>
+              <w:t>**MySQL Exporter** (`sms-mysql-exporter`)</w:t>
+            </w:r>
+          </w:p>
+        </w:tc>
+        <w:tc>
+          <w:tcPr>
+            <w:tcW w:type="dxa" w:w="1872"/>
+            <w:tcMar>
+              <w:top w:w="80" w:type="dxa"/>
+              <w:bottom w:w="80" w:type="dxa"/>
+              <w:left w:w="100" w:type="dxa"/>
+              <w:right w:w="100" w:type="dxa"/>
+            </w:tcMar>
+          </w:tcPr>
+          <w:p>
+            <w:pPr>
+              <w:spacing w:before="40" w:after="40" w:line="276" w:lineRule="auto"/>
+            </w:pPr>
+            <w:r>
+              <w:rPr>
+                <w:sz w:val="22"/>
+              </w:rPr>
+              <w:t>`9104`</w:t>
+            </w:r>
+          </w:p>
+        </w:tc>
+        <w:tc>
+          <w:tcPr>
+            <w:tcW w:type="dxa" w:w="1872"/>
+            <w:tcMar>
+              <w:top w:w="80" w:type="dxa"/>
+              <w:bottom w:w="80" w:type="dxa"/>
+              <w:left w:w="100" w:type="dxa"/>
+              <w:right w:w="100" w:type="dxa"/>
+            </w:tcMar>
+          </w:tcPr>
+          <w:p>
+            <w:pPr>
+              <w:spacing w:before="40" w:after="40" w:line="276" w:lineRule="auto"/>
+            </w:pPr>
+            <w:r>
+              <w:rPr>
+                <w:sz w:val="22"/>
+              </w:rPr>
+              <w:t>`backend-net`, `monitoring-net`</w:t>
+            </w:r>
+          </w:p>
+        </w:tc>
+        <w:tc>
+          <w:tcPr>
+            <w:tcW w:type="dxa" w:w="1872"/>
+            <w:tcMar>
+              <w:top w:w="80" w:type="dxa"/>
+              <w:bottom w:w="80" w:type="dxa"/>
+              <w:left w:w="100" w:type="dxa"/>
+              <w:right w:w="100" w:type="dxa"/>
+            </w:tcMar>
+          </w:tcPr>
+          <w:p>
+            <w:pPr>
+              <w:spacing w:before="40" w:after="40" w:line="276" w:lineRule="auto"/>
+            </w:pPr>
+            <w:r>
+              <w:rPr>
+                <w:sz w:val="22"/>
+              </w:rPr>
+              <w:t>Thu thập chỉ số hiệu năng truy vấn CSDL cho Prometheus (`http://mysql-exporter:9104/metrics`).</w:t>
+            </w:r>
+          </w:p>
+        </w:tc>
+      </w:tr>
+      <w:tr>
+        <w:tc>
+          <w:tcPr>
+            <w:tcW w:type="dxa" w:w="1872"/>
+            <w:tcMar>
+              <w:top w:w="80" w:type="dxa"/>
+              <w:bottom w:w="80" w:type="dxa"/>
+              <w:left w:w="100" w:type="dxa"/>
+              <w:right w:w="100" w:type="dxa"/>
+            </w:tcMar>
+          </w:tcPr>
+          <w:p>
+            <w:pPr>
+              <w:spacing w:before="40" w:after="40" w:line="276" w:lineRule="auto"/>
+            </w:pPr>
+            <w:r>
+              <w:rPr>
+                <w:sz w:val="22"/>
+              </w:rPr>
+              <w:t>**5**</w:t>
+            </w:r>
+          </w:p>
+        </w:tc>
+        <w:tc>
+          <w:tcPr>
+            <w:tcW w:type="dxa" w:w="1872"/>
+            <w:tcMar>
+              <w:top w:w="80" w:type="dxa"/>
+              <w:bottom w:w="80" w:type="dxa"/>
+              <w:left w:w="100" w:type="dxa"/>
+              <w:right w:w="100" w:type="dxa"/>
+            </w:tcMar>
+          </w:tcPr>
+          <w:p>
+            <w:pPr>
+              <w:spacing w:before="40" w:after="40" w:line="276" w:lineRule="auto"/>
+            </w:pPr>
+            <w:r>
+              <w:rPr>
+                <w:sz w:val="22"/>
+              </w:rPr>
+              <w:t>**Promtail Log Shipper** (`sms-promtail`)</w:t>
+            </w:r>
+          </w:p>
+        </w:tc>
+        <w:tc>
+          <w:tcPr>
+            <w:tcW w:type="dxa" w:w="1872"/>
+            <w:tcMar>
+              <w:top w:w="80" w:type="dxa"/>
+              <w:bottom w:w="80" w:type="dxa"/>
+              <w:left w:w="100" w:type="dxa"/>
+              <w:right w:w="100" w:type="dxa"/>
+            </w:tcMar>
+          </w:tcPr>
+          <w:p>
+            <w:pPr>
+              <w:spacing w:before="40" w:after="40" w:line="276" w:lineRule="auto"/>
+            </w:pPr>
+            <w:r>
+              <w:rPr>
+                <w:sz w:val="22"/>
+              </w:rPr>
+              <w:t>`9080`</w:t>
+            </w:r>
+          </w:p>
+        </w:tc>
+        <w:tc>
+          <w:tcPr>
+            <w:tcW w:type="dxa" w:w="1872"/>
+            <w:tcMar>
+              <w:top w:w="80" w:type="dxa"/>
+              <w:bottom w:w="80" w:type="dxa"/>
+              <w:left w:w="100" w:type="dxa"/>
+              <w:right w:w="100" w:type="dxa"/>
+            </w:tcMar>
+          </w:tcPr>
+          <w:p>
+            <w:pPr>
+              <w:spacing w:before="40" w:after="40" w:line="276" w:lineRule="auto"/>
+            </w:pPr>
+            <w:r>
+              <w:rPr>
+                <w:sz w:val="22"/>
+              </w:rPr>
+              <w:t>`logging-net`</w:t>
+            </w:r>
+          </w:p>
+        </w:tc>
+        <w:tc>
+          <w:tcPr>
+            <w:tcW w:type="dxa" w:w="1872"/>
+            <w:tcMar>
+              <w:top w:w="80" w:type="dxa"/>
+              <w:bottom w:w="80" w:type="dxa"/>
+              <w:left w:w="100" w:type="dxa"/>
+              <w:right w:w="100" w:type="dxa"/>
+            </w:tcMar>
+          </w:tcPr>
+          <w:p>
+            <w:pPr>
+              <w:spacing w:before="40" w:after="40" w:line="276" w:lineRule="auto"/>
+            </w:pPr>
+            <w:r>
+              <w:rPr>
+                <w:sz w:val="22"/>
+              </w:rPr>
+              <w:t>Daemon đọc luồng log container qua `/var/run/docker.sock` và chuyển tiếp đến Loki qua cổng `3100`.</w:t>
+            </w:r>
+          </w:p>
+        </w:tc>
+      </w:tr>
+    </w:tbl>
+    <w:p>
+      <w:pPr>
         <w:jc w:val="both"/>
       </w:pPr>
       <w:r>
@@ -448,7 +2570,46 @@
         <w:rPr>
           <w:b/>
         </w:rPr>
-        <w:t>Tên người dùng Git</w:t>
+        <w:t>Sinh viên thực hiện</w:t>
+      </w:r>
+      <w:r>
+        <w:t xml:space="preserve">: </w:t>
+      </w:r>
+      <w:r>
+        <w:rPr>
+          <w:b/>
+        </w:rPr>
+        <w:t>Đỗ Ngọc Anh</w:t>
+      </w:r>
+      <w:r/>
+    </w:p>
+    <w:p>
+      <w:pPr>
+        <w:pStyle w:val="ListBullet"/>
+        <w:spacing w:after="60" w:line="300" w:lineRule="auto"/>
+      </w:pPr>
+      <w:r/>
+      <w:r>
+        <w:rPr>
+          <w:b/>
+        </w:rPr>
+        <w:t>Mã số sinh viên (MSSV)</w:t>
+      </w:r>
+      <w:r>
+        <w:t>: `DTC245200527`</w:t>
+      </w:r>
+    </w:p>
+    <w:p>
+      <w:pPr>
+        <w:pStyle w:val="ListBullet"/>
+        <w:spacing w:after="60" w:line="300" w:lineRule="auto"/>
+      </w:pPr>
+      <w:r/>
+      <w:r>
+        <w:rPr>
+          <w:b/>
+        </w:rPr>
+        <w:t>Tên người dùng Git (Username)</w:t>
       </w:r>
       <w:r>
         <w:t>: `dtc245200527-coder`</w:t>
@@ -2679,7 +4840,7 @@
               <w:rPr>
                 <w:sz w:val="22"/>
               </w:rPr>
-              <w:t>Đầy đủ mã nguồn, đúng định danh `dtc245200527-coder`, đủ 3 mốc commit có ý nghĩa, có README chuẩn chỉ.</w:t>
+              <w:t>Đầy đủ mã nguồn, đúng định danh sinh viên Đỗ Ngọc Anh (`dtc245200527-coder`), đủ 3 mốc commit có ý nghĩa, có README chuẩn chỉ.</w:t>
             </w:r>
           </w:p>
         </w:tc>
@@ -3441,7 +5602,7 @@
           <w:color w:val="475569"/>
           <w:sz w:val="22"/>
         </w:rPr>
-        <w:t>Sinh viên: `dtc245200527-coder` (DTC245200527)</w:t>
+        <w:t>Sinh viên: **Đỗ Ngọc Anh** (MSSV: DTC245200527 - GitHub: `dtc245200527-coder`)</w:t>
       </w:r>
     </w:p>
     <w:sectPr>

</xml_diff>